<commit_message>
docs(crucible): paper v2 — template appendix; agent section trimmed
Co-Authored-By: Claude Fable 5 <noreply@anthropic.com>
</commit_message>
<xml_diff>
--- a/IGNORE/The Crucible/The-Crucible-paper.docx
+++ b/IGNORE/The Crucible/The-Crucible-paper.docx
@@ -1708,22 +1708,6 @@
     </w:p>
     <w:p>
       <w:pPr>
-        <w:pStyle w:val="Heading2"/>
-        <w:spacing w:after="140" w:before="260"/>
-      </w:pPr>
-      <w:r>
-        <w:rPr>
-          <w:b/>
-          <w:bCs/>
-          <w:color w:val="2A3A5C"/>
-          <w:sz w:val="24"/>
-          <w:szCs w:val="24"/>
-        </w:rPr>
-        <w:t xml:space="preserve">3.6 Agent-assisted execution</w:t>
-      </w:r>
-    </w:p>
-    <w:p>
-      <w:pPr>
         <w:spacing w:after="160" w:line="276"/>
         <w:jc w:val="both"/>
       </w:pPr>
@@ -1732,7 +1716,7 @@
           <w:sz w:val="22"/>
           <w:szCs w:val="22"/>
         </w:rPr>
-        <w:t xml:space="preserve">Both campaigns to date were executed by a large-language-model coding agent (Claude, Anthropic) operating the probe scripts, the UI driver, and the fix clusters under the owner’s direction and review. The methodology does not require this, but it is well suited to it: the register format, the mechanical-reproduction standard, and the template checklist give an agent exactly the structure it needs to work autonomously for long stretches while remaining auditable. The owner retained design authority (scope, severity calls, fix approval, release decisions) throughout.</w:t>
+        <w:t xml:space="preserve">A practical note on execution: both campaigns to date were carried out with an LLM coding agent operating the probes, UI driver, and fix clusters under the owner’s direction and review; the methodology neither requires nor precludes this, and the owner retained all scope, severity, and release decisions.</w:t>
       </w:r>
     </w:p>
     <w:p>
@@ -4678,6 +4662,482 @@
           <w:szCs w:val="20"/>
         </w:rPr>
         <w:t xml:space="preserve">[9] International Organization for Standardization, ISO 9001:2015 Quality management systems — Requirements. Geneva, 2015.</w:t>
+      </w:r>
+    </w:p>
+    <w:p>
+      <w:r>
+        <w:br w:type="page"/>
+      </w:r>
+    </w:p>
+    <w:p>
+      <w:pPr>
+        <w:pStyle w:val="Heading1"/>
+        <w:spacing w:after="180" w:before="320"/>
+      </w:pPr>
+      <w:r>
+        <w:rPr>
+          <w:b/>
+          <w:bCs/>
+          <w:color w:val="141C2E"/>
+          <w:sz w:val="28"/>
+          <w:szCs w:val="28"/>
+        </w:rPr>
+        <w:t xml:space="preserve">Appendix A. The Campaign Template</w:t>
+      </w:r>
+    </w:p>
+    <w:p>
+      <w:pPr>
+        <w:spacing w:after="160" w:line="276"/>
+        <w:jc w:val="both"/>
+      </w:pPr>
+      <w:r>
+        <w:rPr>
+          <w:sz w:val="22"/>
+          <w:szCs w:val="22"/>
+        </w:rPr>
+        <w:t xml:space="preserve">The following template is copied into the project as a fresh defect register at the start of each campaign; it doubles as the execution checklist. It is reproduced verbatim (repository paths retained) to make replication concrete.</w:t>
+      </w:r>
+    </w:p>
+    <w:p>
+      <w:pPr>
+        <w:spacing w:after="20"/>
+      </w:pPr>
+      <w:r>
+        <w:rPr>
+          <w:rFonts w:ascii="Consolas" w:cs="Consolas" w:eastAsia="Consolas" w:hAnsi="Consolas"/>
+          <w:sz w:val="18"/>
+          <w:szCs w:val="18"/>
+        </w:rPr>
+        <w:t xml:space="preserve"># Crucible N — &lt;date&gt;</w:t>
+      </w:r>
+    </w:p>
+    <w:p>
+      <w:pPr>
+        <w:spacing w:after="20"/>
+      </w:pPr>
+      <w:r>
+        <w:rPr>
+          <w:rFonts w:ascii="Consolas" w:cs="Consolas" w:eastAsia="Consolas" w:hAnsi="Consolas"/>
+          <w:sz w:val="18"/>
+          <w:szCs w:val="18"/>
+        </w:rPr>
+        <w:t xml:space="preserve"> </w:t>
+      </w:r>
+    </w:p>
+    <w:p>
+      <w:pPr>
+        <w:spacing w:after="20"/>
+      </w:pPr>
+      <w:r>
+        <w:rPr>
+          <w:rFonts w:ascii="Consolas" w:cs="Consolas" w:eastAsia="Consolas" w:hAnsi="Consolas"/>
+          <w:sz w:val="18"/>
+          <w:szCs w:val="18"/>
+        </w:rPr>
+        <w:t xml:space="preserve">## Define</w:t>
+      </w:r>
+    </w:p>
+    <w:p>
+      <w:pPr>
+        <w:spacing w:after="20"/>
+      </w:pPr>
+      <w:r>
+        <w:rPr>
+          <w:rFonts w:ascii="Consolas" w:cs="Consolas" w:eastAsia="Consolas" w:hAnsi="Consolas"/>
+          <w:sz w:val="18"/>
+          <w:szCs w:val="18"/>
+        </w:rPr>
+        <w:t xml:space="preserve">- Scope: everything shipped since v&lt;last-campaign-release&gt; — list each feature/version</w:t>
+      </w:r>
+    </w:p>
+    <w:p>
+      <w:pPr>
+        <w:spacing w:after="20"/>
+      </w:pPr>
+      <w:r>
+        <w:rPr>
+          <w:rFonts w:ascii="Consolas" w:cs="Consolas" w:eastAsia="Consolas" w:hAnsi="Consolas"/>
+          <w:sz w:val="18"/>
+          <w:szCs w:val="18"/>
+        </w:rPr>
+        <w:t xml:space="preserve">- Instrument: seed vN stress fixture + adversarial probes</w:t>
+      </w:r>
+    </w:p>
+    <w:p>
+      <w:pPr>
+        <w:spacing w:after="20"/>
+      </w:pPr>
+      <w:r>
+        <w:rPr>
+          <w:rFonts w:ascii="Consolas" w:cs="Consolas" w:eastAsia="Consolas" w:hAnsi="Consolas"/>
+          <w:sz w:val="18"/>
+          <w:szCs w:val="18"/>
+        </w:rPr>
+        <w:t xml:space="preserve">- Out of scope / cosmetic → notes backlog</w:t>
+      </w:r>
+    </w:p>
+    <w:p>
+      <w:pPr>
+        <w:spacing w:after="20"/>
+      </w:pPr>
+      <w:r>
+        <w:rPr>
+          <w:rFonts w:ascii="Consolas" w:cs="Consolas" w:eastAsia="Consolas" w:hAnsi="Consolas"/>
+          <w:sz w:val="18"/>
+          <w:szCs w:val="18"/>
+        </w:rPr>
+        <w:t xml:space="preserve"> </w:t>
+      </w:r>
+    </w:p>
+    <w:p>
+      <w:pPr>
+        <w:spacing w:after="20"/>
+      </w:pPr>
+      <w:r>
+        <w:rPr>
+          <w:rFonts w:ascii="Consolas" w:cs="Consolas" w:eastAsia="Consolas" w:hAnsi="Consolas"/>
+          <w:sz w:val="18"/>
+          <w:szCs w:val="18"/>
+        </w:rPr>
+        <w:t xml:space="preserve">## Measure</w:t>
+      </w:r>
+    </w:p>
+    <w:p>
+      <w:pPr>
+        <w:spacing w:after="20"/>
+      </w:pPr>
+      <w:r>
+        <w:rPr>
+          <w:rFonts w:ascii="Consolas" w:cs="Consolas" w:eastAsia="Consolas" w:hAnsi="Consolas"/>
+          <w:sz w:val="18"/>
+          <w:szCs w:val="18"/>
+        </w:rPr>
+        <w:t xml:space="preserve">[ ] Baseline: full suite green (record count)</w:t>
+      </w:r>
+    </w:p>
+    <w:p>
+      <w:pPr>
+        <w:spacing w:after="20"/>
+      </w:pPr>
+      <w:r>
+        <w:rPr>
+          <w:rFonts w:ascii="Consolas" w:cs="Consolas" w:eastAsia="Consolas" w:hAnsi="Consolas"/>
+          <w:sz w:val="18"/>
+          <w:szCs w:val="18"/>
+        </w:rPr>
+        <w:t xml:space="preserve">[ ] Adversarial probes on new pure modules (scratchpad script):</w:t>
+      </w:r>
+    </w:p>
+    <w:p>
+      <w:pPr>
+        <w:spacing w:after="20"/>
+      </w:pPr>
+      <w:r>
+        <w:rPr>
+          <w:rFonts w:ascii="Consolas" w:cs="Consolas" w:eastAsia="Consolas" w:hAnsi="Consolas"/>
+          <w:sz w:val="18"/>
+          <w:szCs w:val="18"/>
+        </w:rPr>
+        <w:t xml:space="preserve">    [ ] impossible values · boundaries · injection strings · unicode · structural abuse</w:t>
+      </w:r>
+    </w:p>
+    <w:p>
+      <w:pPr>
+        <w:spacing w:after="20"/>
+      </w:pPr>
+      <w:r>
+        <w:rPr>
+          <w:rFonts w:ascii="Consolas" w:cs="Consolas" w:eastAsia="Consolas" w:hAnsi="Consolas"/>
+          <w:sz w:val="18"/>
+          <w:szCs w:val="18"/>
+        </w:rPr>
+        <w:t xml:space="preserve">    [ ] interplay pass: for every accepted-garbage finding, trace who reads it</w:t>
+      </w:r>
+    </w:p>
+    <w:p>
+      <w:pPr>
+        <w:spacing w:after="20"/>
+      </w:pPr>
+      <w:r>
+        <w:rPr>
+          <w:rFonts w:ascii="Consolas" w:cs="Consolas" w:eastAsia="Consolas" w:hAnsi="Consolas"/>
+          <w:sz w:val="18"/>
+          <w:szCs w:val="18"/>
+        </w:rPr>
+        <w:t xml:space="preserve">[ ] Seed → live driver sweep of the running application:</w:t>
+      </w:r>
+    </w:p>
+    <w:p>
+      <w:pPr>
+        <w:spacing w:after="20"/>
+      </w:pPr>
+      <w:r>
+        <w:rPr>
+          <w:rFonts w:ascii="Consolas" w:cs="Consolas" w:eastAsia="Consolas" w:hAnsi="Consolas"/>
+          <w:sz w:val="18"/>
+          <w:szCs w:val="18"/>
+        </w:rPr>
+        <w:t xml:space="preserve">    [ ] close the installed app first (single-instance lock), relaunch after</w:t>
+      </w:r>
+    </w:p>
+    <w:p>
+      <w:pPr>
+        <w:spacing w:after="20"/>
+      </w:pPr>
+      <w:r>
+        <w:rPr>
+          <w:rFonts w:ascii="Consolas" w:cs="Consolas" w:eastAsia="Consolas" w:hAnsi="Consolas"/>
+          <w:sz w:val="18"/>
+          <w:szCs w:val="18"/>
+        </w:rPr>
+        <w:t xml:space="preserve">    [ ] every in-scope surface: screenshot + XSS canary title check</w:t>
+      </w:r>
+    </w:p>
+    <w:p>
+      <w:pPr>
+        <w:spacing w:after="20"/>
+      </w:pPr>
+      <w:r>
+        <w:rPr>
+          <w:rFonts w:ascii="Consolas" w:cs="Consolas" w:eastAsia="Consolas" w:hAnsi="Consolas"/>
+          <w:sz w:val="18"/>
+          <w:szCs w:val="18"/>
+        </w:rPr>
+        <w:t xml:space="preserve">    [ ] hostile commits through real IPC → inspect what landed in the store</w:t>
+      </w:r>
+    </w:p>
+    <w:p>
+      <w:pPr>
+        <w:spacing w:after="20"/>
+      </w:pPr>
+      <w:r>
+        <w:rPr>
+          <w:rFonts w:ascii="Consolas" w:cs="Consolas" w:eastAsia="Consolas" w:hAnsi="Consolas"/>
+          <w:sz w:val="18"/>
+          <w:szCs w:val="18"/>
+        </w:rPr>
+        <w:t xml:space="preserve">    [ ] re-seed when done (test pollution)</w:t>
+      </w:r>
+    </w:p>
+    <w:p>
+      <w:pPr>
+        <w:spacing w:after="20"/>
+      </w:pPr>
+      <w:r>
+        <w:rPr>
+          <w:rFonts w:ascii="Consolas" w:cs="Consolas" w:eastAsia="Consolas" w:hAnsi="Consolas"/>
+          <w:sz w:val="18"/>
+          <w:szCs w:val="18"/>
+        </w:rPr>
+        <w:t xml:space="preserve"> </w:t>
+      </w:r>
+    </w:p>
+    <w:p>
+      <w:pPr>
+        <w:spacing w:after="20"/>
+      </w:pPr>
+      <w:r>
+        <w:rPr>
+          <w:rFonts w:ascii="Consolas" w:cs="Consolas" w:eastAsia="Consolas" w:hAnsi="Consolas"/>
+          <w:sz w:val="18"/>
+          <w:szCs w:val="18"/>
+        </w:rPr>
+        <w:t xml:space="preserve">## Defects (Analyze — RCA required before a row lands here)</w:t>
+      </w:r>
+    </w:p>
+    <w:p>
+      <w:pPr>
+        <w:spacing w:after="20"/>
+      </w:pPr>
+      <w:r>
+        <w:rPr>
+          <w:rFonts w:ascii="Consolas" w:cs="Consolas" w:eastAsia="Consolas" w:hAnsi="Consolas"/>
+          <w:sz w:val="18"/>
+          <w:szCs w:val="18"/>
+        </w:rPr>
+        <w:t xml:space="preserve">| ID | Sev | Surface | Defect (root cause) | Verified how |</w:t>
+      </w:r>
+    </w:p>
+    <w:p>
+      <w:pPr>
+        <w:spacing w:after="20"/>
+      </w:pPr>
+      <w:r>
+        <w:rPr>
+          <w:rFonts w:ascii="Consolas" w:cs="Consolas" w:eastAsia="Consolas" w:hAnsi="Consolas"/>
+          <w:sz w:val="18"/>
+          <w:szCs w:val="18"/>
+        </w:rPr>
+        <w:t xml:space="preserve"> </w:t>
+      </w:r>
+    </w:p>
+    <w:p>
+      <w:pPr>
+        <w:spacing w:after="20"/>
+      </w:pPr>
+      <w:r>
+        <w:rPr>
+          <w:rFonts w:ascii="Consolas" w:cs="Consolas" w:eastAsia="Consolas" w:hAnsi="Consolas"/>
+          <w:sz w:val="18"/>
+          <w:szCs w:val="18"/>
+        </w:rPr>
+        <w:t xml:space="preserve">## Verified clean</w:t>
+      </w:r>
+    </w:p>
+    <w:p>
+      <w:pPr>
+        <w:spacing w:after="20"/>
+      </w:pPr>
+      <w:r>
+        <w:rPr>
+          <w:rFonts w:ascii="Consolas" w:cs="Consolas" w:eastAsia="Consolas" w:hAnsi="Consolas"/>
+          <w:sz w:val="18"/>
+          <w:szCs w:val="18"/>
+        </w:rPr>
+        <w:t xml:space="preserve">- (everything attacked that held — as valuable as the defect list)</w:t>
+      </w:r>
+    </w:p>
+    <w:p>
+      <w:pPr>
+        <w:spacing w:after="20"/>
+      </w:pPr>
+      <w:r>
+        <w:rPr>
+          <w:rFonts w:ascii="Consolas" w:cs="Consolas" w:eastAsia="Consolas" w:hAnsi="Consolas"/>
+          <w:sz w:val="18"/>
+          <w:szCs w:val="18"/>
+        </w:rPr>
+        <w:t xml:space="preserve"> </w:t>
+      </w:r>
+    </w:p>
+    <w:p>
+      <w:pPr>
+        <w:spacing w:after="20"/>
+      </w:pPr>
+      <w:r>
+        <w:rPr>
+          <w:rFonts w:ascii="Consolas" w:cs="Consolas" w:eastAsia="Consolas" w:hAnsi="Consolas"/>
+          <w:sz w:val="18"/>
+          <w:szCs w:val="18"/>
+        </w:rPr>
+        <w:t xml:space="preserve">## Improve — fix clusters (PDCA)</w:t>
+      </w:r>
+    </w:p>
+    <w:p>
+      <w:pPr>
+        <w:spacing w:after="20"/>
+      </w:pPr>
+      <w:r>
+        <w:rPr>
+          <w:rFonts w:ascii="Consolas" w:cs="Consolas" w:eastAsia="Consolas" w:hAnsi="Consolas"/>
+          <w:sz w:val="18"/>
+          <w:szCs w:val="18"/>
+        </w:rPr>
+        <w:t xml:space="preserve">| Cluster | Defects | Fix | PR | Checked by |</w:t>
+      </w:r>
+    </w:p>
+    <w:p>
+      <w:pPr>
+        <w:spacing w:after="20"/>
+      </w:pPr>
+      <w:r>
+        <w:rPr>
+          <w:rFonts w:ascii="Consolas" w:cs="Consolas" w:eastAsia="Consolas" w:hAnsi="Consolas"/>
+          <w:sz w:val="18"/>
+          <w:szCs w:val="18"/>
+        </w:rPr>
+        <w:t xml:space="preserve">  (checked by: original probe re-run + suite + live pass)</w:t>
+      </w:r>
+    </w:p>
+    <w:p>
+      <w:pPr>
+        <w:spacing w:after="20"/>
+      </w:pPr>
+      <w:r>
+        <w:rPr>
+          <w:rFonts w:ascii="Consolas" w:cs="Consolas" w:eastAsia="Consolas" w:hAnsi="Consolas"/>
+          <w:sz w:val="18"/>
+          <w:szCs w:val="18"/>
+        </w:rPr>
+        <w:t xml:space="preserve"> </w:t>
+      </w:r>
+    </w:p>
+    <w:p>
+      <w:pPr>
+        <w:spacing w:after="20"/>
+      </w:pPr>
+      <w:r>
+        <w:rPr>
+          <w:rFonts w:ascii="Consolas" w:cs="Consolas" w:eastAsia="Consolas" w:hAnsi="Consolas"/>
+          <w:sz w:val="18"/>
+          <w:szCs w:val="18"/>
+        </w:rPr>
+        <w:t xml:space="preserve">## Control — close-out</w:t>
+      </w:r>
+    </w:p>
+    <w:p>
+      <w:pPr>
+        <w:spacing w:after="20"/>
+      </w:pPr>
+      <w:r>
+        <w:rPr>
+          <w:rFonts w:ascii="Consolas" w:cs="Consolas" w:eastAsia="Consolas" w:hAnsi="Consolas"/>
+          <w:sz w:val="18"/>
+          <w:szCs w:val="18"/>
+        </w:rPr>
+        <w:t xml:space="preserve">[ ] All register rows fixed or explicitly deferred (with reason)</w:t>
+      </w:r>
+    </w:p>
+    <w:p>
+      <w:pPr>
+        <w:spacing w:after="20"/>
+      </w:pPr>
+      <w:r>
+        <w:rPr>
+          <w:rFonts w:ascii="Consolas" w:cs="Consolas" w:eastAsia="Consolas" w:hAnsi="Consolas"/>
+          <w:sz w:val="18"/>
+          <w:szCs w:val="18"/>
+        </w:rPr>
+        <w:t xml:space="preserve">[ ] Regression test per defect (rejection + adjacent legal behavior)</w:t>
+      </w:r>
+    </w:p>
+    <w:p>
+      <w:pPr>
+        <w:spacing w:after="20"/>
+      </w:pPr>
+      <w:r>
+        <w:rPr>
+          <w:rFonts w:ascii="Consolas" w:cs="Consolas" w:eastAsia="Consolas" w:hAnsi="Consolas"/>
+          <w:sz w:val="18"/>
+          <w:szCs w:val="18"/>
+        </w:rPr>
+        <w:t xml:space="preserve">[ ] Release cut: v___</w:t>
+      </w:r>
+    </w:p>
+    <w:p>
+      <w:pPr>
+        <w:spacing w:after="20"/>
+      </w:pPr>
+      <w:r>
+        <w:rPr>
+          <w:rFonts w:ascii="Consolas" w:cs="Consolas" w:eastAsia="Consolas" w:hAnsi="Consolas"/>
+          <w:sz w:val="18"/>
+          <w:szCs w:val="18"/>
+        </w:rPr>
+        <w:t xml:space="preserve">[ ] Lessons made permanent: engineering-guide gotcha / seed probe / test oracle</w:t>
+      </w:r>
+    </w:p>
+    <w:p>
+      <w:pPr>
+        <w:spacing w:after="20"/>
+      </w:pPr>
+      <w:r>
+        <w:rPr>
+          <w:rFonts w:ascii="Consolas" w:cs="Consolas" w:eastAsia="Consolas" w:hAnsi="Consolas"/>
+          <w:sz w:val="18"/>
+          <w:szCs w:val="18"/>
+        </w:rPr>
+        <w:t xml:space="preserve">[ ] Crucible history table updated</w:t>
       </w:r>
     </w:p>
     <w:sectPr>

</xml_diff>

<commit_message>
docs(crucible): paper v3 — author interview material woven in
Origin (end-of-Phase-1 test + held seed), author pedigree (Six Sigma
YB/GB training, 2009 GameStop DC shipping-line RCA), security-first
context with 7-user stakes, 24-36h campaign cost, zero functional
field escapes (with small-exposure caveat), manual-first execution
framing with agent assistance as a wall-clock accelerator.

Co-Authored-By: Claude Fable 5 <noreply@anthropic.com>
</commit_message>
<xml_diff>
--- a/IGNORE/The Crucible/The-Crucible-paper.docx
+++ b/IGNORE/The Crucible/The-Crucible-paper.docx
@@ -237,6 +237,32 @@
           <w:szCs w:val="22"/>
         </w:rPr>
         <w:t xml:space="preserve">The name reflects the intent: a crucible is the vessel in which a material is melted so that its impurities can be burned away and what remains proven. Each campaign deliberately subjects everything shipped since the previous campaign to hostile inputs and edge conditions, on the theory that it is cheaper for the author to break the software than for a user to.</w:t>
+      </w:r>
+    </w:p>
+    <w:p>
+      <w:pPr>
+        <w:spacing w:after="160" w:line="276"/>
+        <w:jc w:val="both"/>
+      </w:pPr>
+      <w:r>
+        <w:rPr>
+          <w:sz w:val="22"/>
+          <w:szCs w:val="22"/>
+        </w:rPr>
+        <w:t xml:space="preserve">The method has an autobiographical pedigree rather than an academic one. The author received contracted Six Sigma training (Yellow/Green Belt) early in his career, and worked in 2009 at a GameStop distribution center where a plain form of root cause analysis was the standing discipline for shipping-line errors and gaps; PDCA entered the repertoire later, through observation of similar improvement processes. When Conquered Time reached the end of its first development phase, the question was how to run an "end-of-phase" stress test that would not be a one-off: the answer was to compose those familiar loops around a held, versioned development seed — an instrument that could be readjusted and grown alongside the application for current and future phases. Personal experience and research suggested the composition would track well as a bug-search methodology; the two campaigns reported here are the test of that hypothesis.</w:t>
+      </w:r>
+    </w:p>
+    <w:p>
+      <w:pPr>
+        <w:spacing w:after="160" w:line="276"/>
+        <w:jc w:val="both"/>
+      </w:pPr>
+      <w:r>
+        <w:rPr>
+          <w:sz w:val="22"/>
+          <w:szCs w:val="22"/>
+        </w:rPr>
+        <w:t xml:space="preserve">The application context also shaped the method’s temperament. Conquered Time stores encrypted personal and employer-identifying data, and security is its most important property; a high-stress, adversarial testing regime was adopted deliberately to keep that posture consistently tight rather than episodically audited. The beta population is small (seven users at the time of writing, expanding), which raises rather than lowers the stakes per defect: with few users, every escaped defect is experienced by a meaningful fraction of the user base.</w:t>
       </w:r>
     </w:p>
     <w:p>
@@ -1716,7 +1742,7 @@
           <w:sz w:val="22"/>
           <w:szCs w:val="22"/>
         </w:rPr>
-        <w:t xml:space="preserve">A practical note on execution: both campaigns to date were carried out with an LLM coding agent operating the probes, UI driver, and fix clusters under the owner’s direction and review; the methodology neither requires nor precludes this, and the owner retained all scope, severity, and release decisions.</w:t>
+        <w:t xml:space="preserve">A practical note on execution: The Crucible is designed to be fully manually executable — every phase is a human-scale activity (writing probe scripts, driving the application, filling the register). Both campaigns to date were, however, executed with an LLM coding agent operating the probes, UI driver, and fix clusters under the owner’s direction and review; agent assistance changes the wall-clock economics of a campaign without changing the method, and the owner retained all scope, severity, and release decisions.</w:t>
       </w:r>
     </w:p>
     <w:p>
@@ -4376,7 +4402,20 @@
           <w:sz w:val="22"/>
           <w:szCs w:val="22"/>
         </w:rPr>
-        <w:t xml:space="preserve">A secondary result concerns cost. Crucible II — baseline, probes, live sweep, RCA, one fix cluster with five regression tests, and a shipped release — was completed in a single working day by one operator and an agent. The methodology’s overhead above an ad-hoc bug hunt is essentially the register discipline and the permanence work, and the second campaign’s numbers suggest that overhead pays for itself quickly.</w:t>
+        <w:t xml:space="preserve">A secondary result concerns cost. A full campaign — baseline, probes, live sweep, RCA, fix clusters with regression tests, and a shipped remediation release — costs the owner roughly 24–36 hours of attention. With agent assistance, Crucible II compressed that attention into a single calendar day; the method itself is unchanged either way, and the overhead above an ad-hoc bug hunt is essentially the register discipline and the permanence work.</w:t>
+      </w:r>
+    </w:p>
+    <w:p>
+      <w:pPr>
+        <w:spacing w:after="160" w:line="276"/>
+        <w:jc w:val="both"/>
+      </w:pPr>
+      <w:r>
+        <w:rPr>
+          <w:sz w:val="22"/>
+          <w:szCs w:val="22"/>
+        </w:rPr>
+        <w:t xml:space="preserve">Field escape data, while early, is encouraging: across the beta period to date, no functional defect has reached users that either Crucible should have caught — the reported residue has consisted of sizing errors in non-universalized layout code and other aesthetic issues, a class that the Define phase deliberately diverts to a notes backlog rather than the register. The method’s false-negative rate against its own definition of defect is, so far, zero; §8 notes why that claim must be read cautiously.</w:t>
       </w:r>
     </w:p>
     <w:p>
@@ -4478,6 +4517,42 @@
           <w:szCs w:val="22"/>
         </w:rPr>
         <w:t xml:space="preserve">Instrument bias: the fixture probes what its designer thought to probe. Defect classes outside its imagination (performance under scale, concurrency races, OS-integration failures) are under-measured, and D-104 — found only because the campaign itself tripped over it — is a reminder of that boundary.</w:t>
+      </w:r>
+    </w:p>
+    <w:p>
+      <w:pPr>
+        <w:pStyle w:val="ListParagraph"/>
+        <w:numPr>
+          <w:ilvl w:val="0"/>
+          <w:numId w:val="3"/>
+        </w:numPr>
+        <w:spacing w:after="100" w:line="276"/>
+        <w:jc w:val="both"/>
+      </w:pPr>
+      <w:r>
+        <w:rPr>
+          <w:sz w:val="22"/>
+          <w:szCs w:val="22"/>
+        </w:rPr>
+        <w:t xml:space="preserve">Small exposure window: the zero-functional-escape claim rests on seven beta users over weeks, not thousands over years; a small population exercises fewer paths, so field silence is weak evidence.</w:t>
+      </w:r>
+    </w:p>
+    <w:p>
+      <w:pPr>
+        <w:pStyle w:val="ListParagraph"/>
+        <w:numPr>
+          <w:ilvl w:val="0"/>
+          <w:numId w:val="3"/>
+        </w:numPr>
+        <w:spacing w:after="100" w:line="276"/>
+        <w:jc w:val="both"/>
+      </w:pPr>
+      <w:r>
+        <w:rPr>
+          <w:sz w:val="22"/>
+          <w:szCs w:val="22"/>
+        </w:rPr>
+        <w:t xml:space="preserve">Untested adjudication: to date no finding has been disputed between the operator and the RCA admission standard; the process for resolving such a disagreement is therefore undescribed and untested.</w:t>
       </w:r>
     </w:p>
     <w:p>

</xml_diff>

<commit_message>
docs(crucible): paper v4 — §8 layout linter (mechanical visual detection)
New section: three-tier visual-defect taxonomy (mechanical / golden-diff
/ rubric), the linter reference implementation, and its calibration run
as the permanence rule applied to the instrument itself. Threats and
Conclusion renumbered §9/§10.

Co-Authored-By: Claude Fable 5 <noreply@anthropic.com>
</commit_message>
<xml_diff>
--- a/IGNORE/The Crucible/The-Crucible-paper.docx
+++ b/IGNORE/The Crucible/The-Crucible-paper.docx
@@ -4415,7 +4415,7 @@
           <w:sz w:val="22"/>
           <w:szCs w:val="22"/>
         </w:rPr>
-        <w:t xml:space="preserve">Field escape data, while early, is encouraging: across the beta period to date, no functional defect has reached users that either Crucible should have caught — the reported residue has consisted of sizing errors in non-universalized layout code and other aesthetic issues, a class that the Define phase deliberately diverts to a notes backlog rather than the register. The method’s false-negative rate against its own definition of defect is, so far, zero; §8 notes why that claim must be read cautiously.</w:t>
+        <w:t xml:space="preserve">Field escape data, while early, is encouraging: across the beta period to date, no functional defect has reached users that either Crucible should have caught — the reported residue has consisted of sizing errors in non-universalized layout code and other aesthetic issues, a class that the Define phase deliberately diverts to a notes backlog rather than the register. The method’s false-negative rate against its own definition of defect is, so far, zero; §9 notes why that claim must be read cautiously.</w:t>
       </w:r>
     </w:p>
     <w:p>
@@ -4444,7 +4444,62 @@
           <w:sz w:val="28"/>
           <w:szCs w:val="28"/>
         </w:rPr>
-        <w:t xml:space="preserve">8. Threats to Validity</w:t>
+        <w:t xml:space="preserve">8. Extending the Instrument: Mechanical Detection of Visual Defects</w:t>
+      </w:r>
+    </w:p>
+    <w:p>
+      <w:pPr>
+        <w:spacing w:after="160" w:line="276"/>
+        <w:jc w:val="both"/>
+      </w:pPr>
+      <w:r>
+        <w:rPr>
+          <w:sz w:val="22"/>
+          <w:szCs w:val="22"/>
+        </w:rPr>
+        <w:t xml:space="preserve">The field residue reported in §7 — sizing errors and aesthetic issues — identifies the instrument’s largest blind spot: the Crucible as described asserts on data, never on appearance. Analysis of that residue suggests visual defects divide into three tiers demanding different detectors with different trust levels. First, a substantial subclass is geometrically provable — clipped text, elements collapsed to near-zero size, overlapping or unreachable controls, and text whose computed contrast falls below legibility thresholds are all facts about the rendered box model, requiring no aesthetic judgment. Second, unintended visual change is detectable by perceptual screenshot comparison against blessed baselines, at the cost of baseline maintenance. Third, genuinely aesthetic judgments (spacing, balance, coherence) require a human or model reviewer working from a rubric. The Crucible admits only the first tier to the register: it alone meets the RCA standard of mechanical reproduction. Golden-image diffs are admissible after human confirmation that the change was unintended; rubric findings are diverted to the notes backlog unless converted to a mechanical reproduction.</w:t>
+      </w:r>
+    </w:p>
+    <w:p>
+      <w:pPr>
+        <w:spacing w:after="160" w:line="276"/>
+        <w:jc w:val="both"/>
+      </w:pPr>
+      <w:r>
+        <w:rPr>
+          <w:sz w:val="22"/>
+          <w:szCs w:val="22"/>
+        </w:rPr>
+        <w:t xml:space="preserve">A reference implementation of the first tier — a layout linter — was added to the instrument following Crucible II. Injected into the running application by the campaign driver, it sweeps the live DOM in tens of milliseconds per page and reports faults deduplicated by structural selector: text overflowing its box without intentional ellipsis or scrolling; visible elements carrying text but rendered at near-zero size (the class of a costly historical defect in which flexbox children silently collapsed inside scrollable columns); interactive controls that materially overlap or lie outside any reachable scroll extent; and text below a 2.5:1 luminance contrast ratio on a computable solid background.</w:t>
+      </w:r>
+    </w:p>
+    <w:p>
+      <w:pPr>
+        <w:spacing w:after="160" w:line="276"/>
+        <w:jc w:val="both"/>
+      </w:pPr>
+      <w:r>
+        <w:rPr>
+          <w:sz w:val="22"/>
+          <w:szCs w:val="22"/>
+        </w:rPr>
+        <w:t xml:space="preserve">The linter’s own calibration run illustrates the methodology applied to its instrument. Its first full sweep reported thirty faults across eight pages; triage against the running application showed three false-positive classes — controls below the fold of an inner scrolling container misread as offscreen, "overlaps" with a closed modal whose invisibility was inherited from an ancestor’s opacity, and box-model assertions applied inside SVG, where they are meaningless. All three were corrected (scroll-container-aware bounds; ancestor-aware visibility; SVG exclusion), after which a re-sweep reported two pages fully clean and zero fabricated faults. What survived was signal: a page-wide cluster of secondary text measuring approximately 2.4:1 — an intentional muted-text design token that nonetheless sits below the 3:1 WCAG floor for large text — and one unambiguous defect, an active navigation tab rendering at 1.65:1. Both entered the register queue for the next campaign. The episode also demonstrates the permanence rule operating on the instrument itself: each false-positive class became a documented rule inside the linter, exactly as escaped defects become seed probes.</w:t>
+      </w:r>
+    </w:p>
+    <w:p>
+      <w:pPr>
+        <w:pStyle w:val="Heading1"/>
+        <w:spacing w:after="180" w:before="320"/>
+      </w:pPr>
+      <w:r>
+        <w:rPr>
+          <w:b/>
+          <w:bCs/>
+          <w:color w:val="141C2E"/>
+          <w:sz w:val="28"/>
+          <w:szCs w:val="28"/>
+        </w:rPr>
+        <w:t xml:space="preserve">9. Threats to Validity</w:t>
       </w:r>
     </w:p>
     <w:p>
@@ -4586,7 +4641,7 @@
           <w:sz w:val="28"/>
           <w:szCs w:val="28"/>
         </w:rPr>
-        <w:t xml:space="preserve">9. Conclusion and Future Work</w:t>
+        <w:t xml:space="preserve">10. Conclusion and Future Work</w:t>
       </w:r>
     </w:p>
     <w:p>

</xml_diff>